<commit_message>
complete ground truth for 100 data and try to fix orientation/color post processing in module 1
</commit_message>
<xml_diff>
--- a/Tài liệu nghiên cứu,đề xuât mô hình và thuật toán cho các module.docx
+++ b/Tài liệu nghiên cứu,đề xuât mô hình và thuật toán cho các module.docx
@@ -1783,7 +1783,6 @@
           <w:rFonts w:asciiTheme="majorHAnsi" w:hAnsiTheme="majorHAnsi" w:cstheme="majorHAnsi"/>
           <w:sz w:val="26"/>
           <w:szCs w:val="26"/>
-          <w:lang w:val="en-US"/>
         </w:rPr>
       </w:pPr>
       <w:r>
@@ -1802,7 +1801,6 @@
           <w:rFonts w:asciiTheme="majorHAnsi" w:hAnsiTheme="majorHAnsi" w:cstheme="majorHAnsi"/>
           <w:sz w:val="26"/>
           <w:szCs w:val="26"/>
-          <w:lang w:val="en-US"/>
         </w:rPr>
       </w:pPr>
       <w:r>
@@ -2103,29 +2101,7 @@
           <w:sz w:val="32"/>
           <w:szCs w:val="32"/>
         </w:rPr>
-        <w:t>2.</w:t>
-      </w:r>
-      <w:r>
-        <w:rPr>
-          <w:rFonts w:asciiTheme="majorHAnsi" w:hAnsiTheme="majorHAnsi" w:cstheme="majorHAnsi"/>
-          <w:b/>
-          <w:bCs/>
-          <w:color w:val="000000" w:themeColor="text1"/>
-          <w:sz w:val="32"/>
-          <w:szCs w:val="32"/>
-        </w:rPr>
-        <w:t>1</w:t>
-      </w:r>
-      <w:r>
-        <w:rPr>
-          <w:rFonts w:asciiTheme="majorHAnsi" w:hAnsiTheme="majorHAnsi" w:cstheme="majorHAnsi"/>
-          <w:b/>
-          <w:bCs/>
-          <w:color w:val="000000" w:themeColor="text1"/>
-          <w:sz w:val="32"/>
-          <w:szCs w:val="32"/>
-        </w:rPr>
-        <w:t xml:space="preserve"> PHÂN TÍCH CÁC MÔ HÌNH / KIẾN TRÚC ĐƯỢC ĐỀ XUẤT</w:t>
+        <w:t>2.1 PHÂN TÍCH CÁC MÔ HÌNH / KIẾN TRÚC ĐƯỢC ĐỀ XUẤT</w:t>
       </w:r>
     </w:p>
     <w:p>
@@ -2139,7 +2115,6 @@
           <w:color w:val="000000" w:themeColor="text1"/>
           <w:sz w:val="36"/>
           <w:szCs w:val="36"/>
-          <w:lang w:val="en-US"/>
         </w:rPr>
       </w:pPr>
       <w:r>
@@ -2163,7 +2138,6 @@
           <w:color w:val="000000" w:themeColor="text1"/>
           <w:sz w:val="26"/>
           <w:szCs w:val="26"/>
-          <w:lang w:val="en-US"/>
         </w:rPr>
       </w:pPr>
       <w:r>
@@ -2198,12 +2172,6 @@
         <w:gridCol w:w="4860"/>
       </w:tblGrid>
       <w:tr>
-        <w:tblPrEx>
-          <w:tblCellMar>
-            <w:top w:w="0" w:type="dxa"/>
-            <w:bottom w:w="0" w:type="dxa"/>
-          </w:tblCellMar>
-        </w:tblPrEx>
         <w:tc>
           <w:tcPr>
             <w:tcW w:w="4500" w:type="dxa"/>
@@ -2516,12 +2484,6 @@
         <w:gridCol w:w="4860"/>
       </w:tblGrid>
       <w:tr>
-        <w:tblPrEx>
-          <w:tblCellMar>
-            <w:top w:w="0" w:type="dxa"/>
-            <w:bottom w:w="0" w:type="dxa"/>
-          </w:tblCellMar>
-        </w:tblPrEx>
         <w:tc>
           <w:tcPr>
             <w:tcW w:w="4500" w:type="dxa"/>
@@ -2991,12 +2953,6 @@
         <w:gridCol w:w="2460"/>
       </w:tblGrid>
       <w:tr>
-        <w:tblPrEx>
-          <w:tblCellMar>
-            <w:top w:w="0" w:type="dxa"/>
-            <w:bottom w:w="0" w:type="dxa"/>
-          </w:tblCellMar>
-        </w:tblPrEx>
         <w:tc>
           <w:tcPr>
             <w:tcW w:w="2500" w:type="dxa"/>
@@ -3155,12 +3111,6 @@
         </w:tc>
       </w:tr>
       <w:tr>
-        <w:tblPrEx>
-          <w:tblCellMar>
-            <w:top w:w="0" w:type="dxa"/>
-            <w:bottom w:w="0" w:type="dxa"/>
-          </w:tblCellMar>
-        </w:tblPrEx>
         <w:tc>
           <w:tcPr>
             <w:tcW w:w="2500" w:type="dxa"/>
@@ -3311,12 +3261,6 @@
         </w:tc>
       </w:tr>
       <w:tr>
-        <w:tblPrEx>
-          <w:tblCellMar>
-            <w:top w:w="0" w:type="dxa"/>
-            <w:bottom w:w="0" w:type="dxa"/>
-          </w:tblCellMar>
-        </w:tblPrEx>
         <w:tc>
           <w:tcPr>
             <w:tcW w:w="2500" w:type="dxa"/>
@@ -3467,12 +3411,6 @@
         </w:tc>
       </w:tr>
       <w:tr>
-        <w:tblPrEx>
-          <w:tblCellMar>
-            <w:top w:w="0" w:type="dxa"/>
-            <w:bottom w:w="0" w:type="dxa"/>
-          </w:tblCellMar>
-        </w:tblPrEx>
         <w:tc>
           <w:tcPr>
             <w:tcW w:w="2500" w:type="dxa"/>
@@ -4274,12 +4212,6 @@
         <w:gridCol w:w="4860"/>
       </w:tblGrid>
       <w:tr>
-        <w:tblPrEx>
-          <w:tblCellMar>
-            <w:top w:w="0" w:type="dxa"/>
-            <w:bottom w:w="0" w:type="dxa"/>
-          </w:tblCellMar>
-        </w:tblPrEx>
         <w:tc>
           <w:tcPr>
             <w:tcW w:w="4500" w:type="dxa"/>
@@ -4867,7 +4799,6 @@
           <w:color w:val="000000" w:themeColor="text1"/>
           <w:sz w:val="26"/>
           <w:szCs w:val="26"/>
-          <w:lang w:val="en-US"/>
         </w:rPr>
       </w:pPr>
       <w:r>
@@ -4902,12 +4833,6 @@
         <w:gridCol w:w="4860"/>
       </w:tblGrid>
       <w:tr>
-        <w:tblPrEx>
-          <w:tblCellMar>
-            <w:top w:w="0" w:type="dxa"/>
-            <w:bottom w:w="0" w:type="dxa"/>
-          </w:tblCellMar>
-        </w:tblPrEx>
         <w:tc>
           <w:tcPr>
             <w:tcW w:w="4500" w:type="dxa"/>
@@ -5348,12 +5273,6 @@
         <w:gridCol w:w="4860"/>
       </w:tblGrid>
       <w:tr>
-        <w:tblPrEx>
-          <w:tblCellMar>
-            <w:top w:w="0" w:type="dxa"/>
-            <w:bottom w:w="0" w:type="dxa"/>
-          </w:tblCellMar>
-        </w:tblPrEx>
         <w:tc>
           <w:tcPr>
             <w:tcW w:w="4500" w:type="dxa"/>
@@ -5742,12 +5661,6 @@
         <w:gridCol w:w="2200"/>
       </w:tblGrid>
       <w:tr>
-        <w:tblPrEx>
-          <w:tblCellMar>
-            <w:top w:w="0" w:type="dxa"/>
-            <w:bottom w:w="0" w:type="dxa"/>
-          </w:tblCellMar>
-        </w:tblPrEx>
         <w:tc>
           <w:tcPr>
             <w:tcW w:w="3000" w:type="dxa"/>
@@ -5906,12 +5819,6 @@
         </w:tc>
       </w:tr>
       <w:tr>
-        <w:tblPrEx>
-          <w:tblCellMar>
-            <w:top w:w="0" w:type="dxa"/>
-            <w:bottom w:w="0" w:type="dxa"/>
-          </w:tblCellMar>
-        </w:tblPrEx>
         <w:tc>
           <w:tcPr>
             <w:tcW w:w="3000" w:type="dxa"/>
@@ -6062,12 +5969,6 @@
         </w:tc>
       </w:tr>
       <w:tr>
-        <w:tblPrEx>
-          <w:tblCellMar>
-            <w:top w:w="0" w:type="dxa"/>
-            <w:bottom w:w="0" w:type="dxa"/>
-          </w:tblCellMar>
-        </w:tblPrEx>
         <w:tc>
           <w:tcPr>
             <w:tcW w:w="3000" w:type="dxa"/>
@@ -6218,12 +6119,6 @@
         </w:tc>
       </w:tr>
       <w:tr>
-        <w:tblPrEx>
-          <w:tblCellMar>
-            <w:top w:w="0" w:type="dxa"/>
-            <w:bottom w:w="0" w:type="dxa"/>
-          </w:tblCellMar>
-        </w:tblPrEx>
         <w:tc>
           <w:tcPr>
             <w:tcW w:w="3000" w:type="dxa"/>
@@ -6545,6 +6440,97 @@
         <w:t>License: MIT – thương mại tự do</w:t>
       </w:r>
     </w:p>
+    <w:p>
+      <w:pPr>
+        <w:spacing w:before="40" w:after="40" w:line="240" w:lineRule="auto"/>
+        <w:jc w:val="both"/>
+        <w:rPr>
+          <w:rFonts w:asciiTheme="majorHAnsi" w:hAnsiTheme="majorHAnsi" w:cstheme="majorHAnsi"/>
+          <w:color w:val="000000" w:themeColor="text1"/>
+          <w:sz w:val="26"/>
+          <w:szCs w:val="26"/>
+          <w:lang w:val="en-US"/>
+        </w:rPr>
+      </w:pPr>
+    </w:p>
+    <w:p>
+      <w:pPr>
+        <w:spacing w:before="40" w:after="40" w:line="240" w:lineRule="auto"/>
+        <w:jc w:val="both"/>
+        <w:rPr>
+          <w:rFonts w:asciiTheme="majorHAnsi" w:hAnsiTheme="majorHAnsi" w:cstheme="majorHAnsi"/>
+          <w:color w:val="000000" w:themeColor="text1"/>
+          <w:sz w:val="26"/>
+          <w:szCs w:val="26"/>
+          <w:lang w:val="en-US"/>
+        </w:rPr>
+      </w:pPr>
+    </w:p>
+    <w:p>
+      <w:pPr>
+        <w:spacing w:before="40" w:after="40" w:line="240" w:lineRule="auto"/>
+        <w:jc w:val="both"/>
+        <w:rPr>
+          <w:rFonts w:asciiTheme="majorHAnsi" w:hAnsiTheme="majorHAnsi" w:cstheme="majorHAnsi"/>
+          <w:color w:val="000000" w:themeColor="text1"/>
+          <w:sz w:val="26"/>
+          <w:szCs w:val="26"/>
+          <w:lang w:val="en-US"/>
+        </w:rPr>
+      </w:pPr>
+    </w:p>
+    <w:p>
+      <w:pPr>
+        <w:spacing w:before="40" w:after="40" w:line="240" w:lineRule="auto"/>
+        <w:jc w:val="both"/>
+        <w:rPr>
+          <w:rFonts w:asciiTheme="majorHAnsi" w:hAnsiTheme="majorHAnsi" w:cstheme="majorHAnsi"/>
+          <w:color w:val="000000" w:themeColor="text1"/>
+          <w:sz w:val="26"/>
+          <w:szCs w:val="26"/>
+          <w:lang w:val="en-US"/>
+        </w:rPr>
+      </w:pPr>
+    </w:p>
+    <w:p>
+      <w:pPr>
+        <w:spacing w:before="40" w:after="40" w:line="240" w:lineRule="auto"/>
+        <w:jc w:val="both"/>
+        <w:rPr>
+          <w:rFonts w:asciiTheme="majorHAnsi" w:hAnsiTheme="majorHAnsi" w:cstheme="majorHAnsi"/>
+          <w:color w:val="000000" w:themeColor="text1"/>
+          <w:sz w:val="26"/>
+          <w:szCs w:val="26"/>
+          <w:lang w:val="en-US"/>
+        </w:rPr>
+      </w:pPr>
+    </w:p>
+    <w:p>
+      <w:pPr>
+        <w:spacing w:before="40" w:after="40" w:line="240" w:lineRule="auto"/>
+        <w:jc w:val="both"/>
+        <w:rPr>
+          <w:rFonts w:asciiTheme="majorHAnsi" w:hAnsiTheme="majorHAnsi" w:cstheme="majorHAnsi"/>
+          <w:color w:val="000000" w:themeColor="text1"/>
+          <w:sz w:val="26"/>
+          <w:szCs w:val="26"/>
+          <w:lang w:val="en-US"/>
+        </w:rPr>
+      </w:pPr>
+    </w:p>
+    <w:p>
+      <w:pPr>
+        <w:spacing w:before="40" w:after="40" w:line="240" w:lineRule="auto"/>
+        <w:jc w:val="both"/>
+        <w:rPr>
+          <w:rFonts w:asciiTheme="majorHAnsi" w:hAnsiTheme="majorHAnsi" w:cstheme="majorHAnsi"/>
+          <w:color w:val="000000" w:themeColor="text1"/>
+          <w:sz w:val="26"/>
+          <w:szCs w:val="26"/>
+          <w:lang w:val="en-US"/>
+        </w:rPr>
+      </w:pPr>
+    </w:p>
     <w:sectPr>
       <w:pgSz w:w="11906" w:h="16838"/>
       <w:pgMar w:top="1440" w:right="1440" w:bottom="1440" w:left="1440" w:header="720" w:footer="720" w:gutter="0"/>
@@ -7055,6 +7041,155 @@
     </w:lvl>
   </w:abstractNum>
   <w:abstractNum w:abstractNumId="4" w15:restartNumberingAfterBreak="0">
+    <w:nsid w:val="20062F57"/>
+    <w:multiLevelType w:val="multilevel"/>
+    <w:tmpl w:val="98AC9F02"/>
+    <w:lvl w:ilvl="0">
+      <w:start w:val="1"/>
+      <w:numFmt w:val="bullet"/>
+      <w:lvlText w:val=""/>
+      <w:lvlJc w:val="left"/>
+      <w:pPr>
+        <w:tabs>
+          <w:tab w:val="num" w:pos="720"/>
+        </w:tabs>
+        <w:ind w:left="720" w:hanging="360"/>
+      </w:pPr>
+      <w:rPr>
+        <w:rFonts w:ascii="Symbol" w:hAnsi="Symbol" w:hint="default"/>
+        <w:sz w:val="20"/>
+      </w:rPr>
+    </w:lvl>
+    <w:lvl w:ilvl="1" w:tentative="1">
+      <w:start w:val="1"/>
+      <w:numFmt w:val="bullet"/>
+      <w:lvlText w:val="o"/>
+      <w:lvlJc w:val="left"/>
+      <w:pPr>
+        <w:tabs>
+          <w:tab w:val="num" w:pos="1440"/>
+        </w:tabs>
+        <w:ind w:left="1440" w:hanging="360"/>
+      </w:pPr>
+      <w:rPr>
+        <w:rFonts w:ascii="Courier New" w:hAnsi="Courier New" w:hint="default"/>
+        <w:sz w:val="20"/>
+      </w:rPr>
+    </w:lvl>
+    <w:lvl w:ilvl="2" w:tentative="1">
+      <w:start w:val="1"/>
+      <w:numFmt w:val="bullet"/>
+      <w:lvlText w:val=""/>
+      <w:lvlJc w:val="left"/>
+      <w:pPr>
+        <w:tabs>
+          <w:tab w:val="num" w:pos="2160"/>
+        </w:tabs>
+        <w:ind w:left="2160" w:hanging="360"/>
+      </w:pPr>
+      <w:rPr>
+        <w:rFonts w:ascii="Wingdings" w:hAnsi="Wingdings" w:hint="default"/>
+        <w:sz w:val="20"/>
+      </w:rPr>
+    </w:lvl>
+    <w:lvl w:ilvl="3" w:tentative="1">
+      <w:start w:val="1"/>
+      <w:numFmt w:val="bullet"/>
+      <w:lvlText w:val=""/>
+      <w:lvlJc w:val="left"/>
+      <w:pPr>
+        <w:tabs>
+          <w:tab w:val="num" w:pos="2880"/>
+        </w:tabs>
+        <w:ind w:left="2880" w:hanging="360"/>
+      </w:pPr>
+      <w:rPr>
+        <w:rFonts w:ascii="Wingdings" w:hAnsi="Wingdings" w:hint="default"/>
+        <w:sz w:val="20"/>
+      </w:rPr>
+    </w:lvl>
+    <w:lvl w:ilvl="4" w:tentative="1">
+      <w:start w:val="1"/>
+      <w:numFmt w:val="bullet"/>
+      <w:lvlText w:val=""/>
+      <w:lvlJc w:val="left"/>
+      <w:pPr>
+        <w:tabs>
+          <w:tab w:val="num" w:pos="3600"/>
+        </w:tabs>
+        <w:ind w:left="3600" w:hanging="360"/>
+      </w:pPr>
+      <w:rPr>
+        <w:rFonts w:ascii="Wingdings" w:hAnsi="Wingdings" w:hint="default"/>
+        <w:sz w:val="20"/>
+      </w:rPr>
+    </w:lvl>
+    <w:lvl w:ilvl="5" w:tentative="1">
+      <w:start w:val="1"/>
+      <w:numFmt w:val="bullet"/>
+      <w:lvlText w:val=""/>
+      <w:lvlJc w:val="left"/>
+      <w:pPr>
+        <w:tabs>
+          <w:tab w:val="num" w:pos="4320"/>
+        </w:tabs>
+        <w:ind w:left="4320" w:hanging="360"/>
+      </w:pPr>
+      <w:rPr>
+        <w:rFonts w:ascii="Wingdings" w:hAnsi="Wingdings" w:hint="default"/>
+        <w:sz w:val="20"/>
+      </w:rPr>
+    </w:lvl>
+    <w:lvl w:ilvl="6" w:tentative="1">
+      <w:start w:val="1"/>
+      <w:numFmt w:val="bullet"/>
+      <w:lvlText w:val=""/>
+      <w:lvlJc w:val="left"/>
+      <w:pPr>
+        <w:tabs>
+          <w:tab w:val="num" w:pos="5040"/>
+        </w:tabs>
+        <w:ind w:left="5040" w:hanging="360"/>
+      </w:pPr>
+      <w:rPr>
+        <w:rFonts w:ascii="Wingdings" w:hAnsi="Wingdings" w:hint="default"/>
+        <w:sz w:val="20"/>
+      </w:rPr>
+    </w:lvl>
+    <w:lvl w:ilvl="7" w:tentative="1">
+      <w:start w:val="1"/>
+      <w:numFmt w:val="bullet"/>
+      <w:lvlText w:val=""/>
+      <w:lvlJc w:val="left"/>
+      <w:pPr>
+        <w:tabs>
+          <w:tab w:val="num" w:pos="5760"/>
+        </w:tabs>
+        <w:ind w:left="5760" w:hanging="360"/>
+      </w:pPr>
+      <w:rPr>
+        <w:rFonts w:ascii="Wingdings" w:hAnsi="Wingdings" w:hint="default"/>
+        <w:sz w:val="20"/>
+      </w:rPr>
+    </w:lvl>
+    <w:lvl w:ilvl="8" w:tentative="1">
+      <w:start w:val="1"/>
+      <w:numFmt w:val="bullet"/>
+      <w:lvlText w:val=""/>
+      <w:lvlJc w:val="left"/>
+      <w:pPr>
+        <w:tabs>
+          <w:tab w:val="num" w:pos="6480"/>
+        </w:tabs>
+        <w:ind w:left="6480" w:hanging="360"/>
+      </w:pPr>
+      <w:rPr>
+        <w:rFonts w:ascii="Wingdings" w:hAnsi="Wingdings" w:hint="default"/>
+        <w:sz w:val="20"/>
+      </w:rPr>
+    </w:lvl>
+  </w:abstractNum>
+  <w:abstractNum w:abstractNumId="5" w15:restartNumberingAfterBreak="0">
     <w:nsid w:val="3047570C"/>
     <w:multiLevelType w:val="hybridMultilevel"/>
     <w:tmpl w:val="77906C0C"/>
@@ -7167,7 +7302,7 @@
       </w:rPr>
     </w:lvl>
   </w:abstractNum>
-  <w:abstractNum w:abstractNumId="5" w15:restartNumberingAfterBreak="0">
+  <w:abstractNum w:abstractNumId="6" w15:restartNumberingAfterBreak="0">
     <w:nsid w:val="3226203F"/>
     <w:multiLevelType w:val="hybridMultilevel"/>
     <w:tmpl w:val="782C9542"/>
@@ -7225,7 +7360,301 @@
       <w:lvlJc w:val="left"/>
     </w:lvl>
   </w:abstractNum>
-  <w:abstractNum w:abstractNumId="6" w15:restartNumberingAfterBreak="0">
+  <w:abstractNum w:abstractNumId="7" w15:restartNumberingAfterBreak="0">
+    <w:nsid w:val="379C14AA"/>
+    <w:multiLevelType w:val="multilevel"/>
+    <w:tmpl w:val="D500F236"/>
+    <w:lvl w:ilvl="0">
+      <w:start w:val="1"/>
+      <w:numFmt w:val="bullet"/>
+      <w:lvlText w:val=""/>
+      <w:lvlJc w:val="left"/>
+      <w:pPr>
+        <w:tabs>
+          <w:tab w:val="num" w:pos="720"/>
+        </w:tabs>
+        <w:ind w:left="720" w:hanging="360"/>
+      </w:pPr>
+      <w:rPr>
+        <w:rFonts w:ascii="Symbol" w:hAnsi="Symbol" w:hint="default"/>
+        <w:sz w:val="20"/>
+      </w:rPr>
+    </w:lvl>
+    <w:lvl w:ilvl="1">
+      <w:start w:val="1"/>
+      <w:numFmt w:val="decimal"/>
+      <w:lvlText w:val="%2."/>
+      <w:lvlJc w:val="left"/>
+      <w:pPr>
+        <w:tabs>
+          <w:tab w:val="num" w:pos="1440"/>
+        </w:tabs>
+        <w:ind w:left="1440" w:hanging="360"/>
+      </w:pPr>
+    </w:lvl>
+    <w:lvl w:ilvl="2" w:tentative="1">
+      <w:start w:val="1"/>
+      <w:numFmt w:val="bullet"/>
+      <w:lvlText w:val=""/>
+      <w:lvlJc w:val="left"/>
+      <w:pPr>
+        <w:tabs>
+          <w:tab w:val="num" w:pos="2160"/>
+        </w:tabs>
+        <w:ind w:left="2160" w:hanging="360"/>
+      </w:pPr>
+      <w:rPr>
+        <w:rFonts w:ascii="Wingdings" w:hAnsi="Wingdings" w:hint="default"/>
+        <w:sz w:val="20"/>
+      </w:rPr>
+    </w:lvl>
+    <w:lvl w:ilvl="3" w:tentative="1">
+      <w:start w:val="1"/>
+      <w:numFmt w:val="bullet"/>
+      <w:lvlText w:val=""/>
+      <w:lvlJc w:val="left"/>
+      <w:pPr>
+        <w:tabs>
+          <w:tab w:val="num" w:pos="2880"/>
+        </w:tabs>
+        <w:ind w:left="2880" w:hanging="360"/>
+      </w:pPr>
+      <w:rPr>
+        <w:rFonts w:ascii="Wingdings" w:hAnsi="Wingdings" w:hint="default"/>
+        <w:sz w:val="20"/>
+      </w:rPr>
+    </w:lvl>
+    <w:lvl w:ilvl="4" w:tentative="1">
+      <w:start w:val="1"/>
+      <w:numFmt w:val="bullet"/>
+      <w:lvlText w:val=""/>
+      <w:lvlJc w:val="left"/>
+      <w:pPr>
+        <w:tabs>
+          <w:tab w:val="num" w:pos="3600"/>
+        </w:tabs>
+        <w:ind w:left="3600" w:hanging="360"/>
+      </w:pPr>
+      <w:rPr>
+        <w:rFonts w:ascii="Wingdings" w:hAnsi="Wingdings" w:hint="default"/>
+        <w:sz w:val="20"/>
+      </w:rPr>
+    </w:lvl>
+    <w:lvl w:ilvl="5" w:tentative="1">
+      <w:start w:val="1"/>
+      <w:numFmt w:val="bullet"/>
+      <w:lvlText w:val=""/>
+      <w:lvlJc w:val="left"/>
+      <w:pPr>
+        <w:tabs>
+          <w:tab w:val="num" w:pos="4320"/>
+        </w:tabs>
+        <w:ind w:left="4320" w:hanging="360"/>
+      </w:pPr>
+      <w:rPr>
+        <w:rFonts w:ascii="Wingdings" w:hAnsi="Wingdings" w:hint="default"/>
+        <w:sz w:val="20"/>
+      </w:rPr>
+    </w:lvl>
+    <w:lvl w:ilvl="6" w:tentative="1">
+      <w:start w:val="1"/>
+      <w:numFmt w:val="bullet"/>
+      <w:lvlText w:val=""/>
+      <w:lvlJc w:val="left"/>
+      <w:pPr>
+        <w:tabs>
+          <w:tab w:val="num" w:pos="5040"/>
+        </w:tabs>
+        <w:ind w:left="5040" w:hanging="360"/>
+      </w:pPr>
+      <w:rPr>
+        <w:rFonts w:ascii="Wingdings" w:hAnsi="Wingdings" w:hint="default"/>
+        <w:sz w:val="20"/>
+      </w:rPr>
+    </w:lvl>
+    <w:lvl w:ilvl="7" w:tentative="1">
+      <w:start w:val="1"/>
+      <w:numFmt w:val="bullet"/>
+      <w:lvlText w:val=""/>
+      <w:lvlJc w:val="left"/>
+      <w:pPr>
+        <w:tabs>
+          <w:tab w:val="num" w:pos="5760"/>
+        </w:tabs>
+        <w:ind w:left="5760" w:hanging="360"/>
+      </w:pPr>
+      <w:rPr>
+        <w:rFonts w:ascii="Wingdings" w:hAnsi="Wingdings" w:hint="default"/>
+        <w:sz w:val="20"/>
+      </w:rPr>
+    </w:lvl>
+    <w:lvl w:ilvl="8" w:tentative="1">
+      <w:start w:val="1"/>
+      <w:numFmt w:val="bullet"/>
+      <w:lvlText w:val=""/>
+      <w:lvlJc w:val="left"/>
+      <w:pPr>
+        <w:tabs>
+          <w:tab w:val="num" w:pos="6480"/>
+        </w:tabs>
+        <w:ind w:left="6480" w:hanging="360"/>
+      </w:pPr>
+      <w:rPr>
+        <w:rFonts w:ascii="Wingdings" w:hAnsi="Wingdings" w:hint="default"/>
+        <w:sz w:val="20"/>
+      </w:rPr>
+    </w:lvl>
+  </w:abstractNum>
+  <w:abstractNum w:abstractNumId="8" w15:restartNumberingAfterBreak="0">
+    <w:nsid w:val="3FDB0471"/>
+    <w:multiLevelType w:val="multilevel"/>
+    <w:tmpl w:val="0A7696BA"/>
+    <w:lvl w:ilvl="0">
+      <w:start w:val="1"/>
+      <w:numFmt w:val="bullet"/>
+      <w:lvlText w:val=""/>
+      <w:lvlJc w:val="left"/>
+      <w:pPr>
+        <w:tabs>
+          <w:tab w:val="num" w:pos="720"/>
+        </w:tabs>
+        <w:ind w:left="720" w:hanging="360"/>
+      </w:pPr>
+      <w:rPr>
+        <w:rFonts w:ascii="Symbol" w:hAnsi="Symbol" w:hint="default"/>
+        <w:sz w:val="20"/>
+      </w:rPr>
+    </w:lvl>
+    <w:lvl w:ilvl="1" w:tentative="1">
+      <w:start w:val="1"/>
+      <w:numFmt w:val="bullet"/>
+      <w:lvlText w:val="o"/>
+      <w:lvlJc w:val="left"/>
+      <w:pPr>
+        <w:tabs>
+          <w:tab w:val="num" w:pos="1440"/>
+        </w:tabs>
+        <w:ind w:left="1440" w:hanging="360"/>
+      </w:pPr>
+      <w:rPr>
+        <w:rFonts w:ascii="Courier New" w:hAnsi="Courier New" w:hint="default"/>
+        <w:sz w:val="20"/>
+      </w:rPr>
+    </w:lvl>
+    <w:lvl w:ilvl="2" w:tentative="1">
+      <w:start w:val="1"/>
+      <w:numFmt w:val="bullet"/>
+      <w:lvlText w:val=""/>
+      <w:lvlJc w:val="left"/>
+      <w:pPr>
+        <w:tabs>
+          <w:tab w:val="num" w:pos="2160"/>
+        </w:tabs>
+        <w:ind w:left="2160" w:hanging="360"/>
+      </w:pPr>
+      <w:rPr>
+        <w:rFonts w:ascii="Wingdings" w:hAnsi="Wingdings" w:hint="default"/>
+        <w:sz w:val="20"/>
+      </w:rPr>
+    </w:lvl>
+    <w:lvl w:ilvl="3" w:tentative="1">
+      <w:start w:val="1"/>
+      <w:numFmt w:val="bullet"/>
+      <w:lvlText w:val=""/>
+      <w:lvlJc w:val="left"/>
+      <w:pPr>
+        <w:tabs>
+          <w:tab w:val="num" w:pos="2880"/>
+        </w:tabs>
+        <w:ind w:left="2880" w:hanging="360"/>
+      </w:pPr>
+      <w:rPr>
+        <w:rFonts w:ascii="Wingdings" w:hAnsi="Wingdings" w:hint="default"/>
+        <w:sz w:val="20"/>
+      </w:rPr>
+    </w:lvl>
+    <w:lvl w:ilvl="4" w:tentative="1">
+      <w:start w:val="1"/>
+      <w:numFmt w:val="bullet"/>
+      <w:lvlText w:val=""/>
+      <w:lvlJc w:val="left"/>
+      <w:pPr>
+        <w:tabs>
+          <w:tab w:val="num" w:pos="3600"/>
+        </w:tabs>
+        <w:ind w:left="3600" w:hanging="360"/>
+      </w:pPr>
+      <w:rPr>
+        <w:rFonts w:ascii="Wingdings" w:hAnsi="Wingdings" w:hint="default"/>
+        <w:sz w:val="20"/>
+      </w:rPr>
+    </w:lvl>
+    <w:lvl w:ilvl="5" w:tentative="1">
+      <w:start w:val="1"/>
+      <w:numFmt w:val="bullet"/>
+      <w:lvlText w:val=""/>
+      <w:lvlJc w:val="left"/>
+      <w:pPr>
+        <w:tabs>
+          <w:tab w:val="num" w:pos="4320"/>
+        </w:tabs>
+        <w:ind w:left="4320" w:hanging="360"/>
+      </w:pPr>
+      <w:rPr>
+        <w:rFonts w:ascii="Wingdings" w:hAnsi="Wingdings" w:hint="default"/>
+        <w:sz w:val="20"/>
+      </w:rPr>
+    </w:lvl>
+    <w:lvl w:ilvl="6" w:tentative="1">
+      <w:start w:val="1"/>
+      <w:numFmt w:val="bullet"/>
+      <w:lvlText w:val=""/>
+      <w:lvlJc w:val="left"/>
+      <w:pPr>
+        <w:tabs>
+          <w:tab w:val="num" w:pos="5040"/>
+        </w:tabs>
+        <w:ind w:left="5040" w:hanging="360"/>
+      </w:pPr>
+      <w:rPr>
+        <w:rFonts w:ascii="Wingdings" w:hAnsi="Wingdings" w:hint="default"/>
+        <w:sz w:val="20"/>
+      </w:rPr>
+    </w:lvl>
+    <w:lvl w:ilvl="7" w:tentative="1">
+      <w:start w:val="1"/>
+      <w:numFmt w:val="bullet"/>
+      <w:lvlText w:val=""/>
+      <w:lvlJc w:val="left"/>
+      <w:pPr>
+        <w:tabs>
+          <w:tab w:val="num" w:pos="5760"/>
+        </w:tabs>
+        <w:ind w:left="5760" w:hanging="360"/>
+      </w:pPr>
+      <w:rPr>
+        <w:rFonts w:ascii="Wingdings" w:hAnsi="Wingdings" w:hint="default"/>
+        <w:sz w:val="20"/>
+      </w:rPr>
+    </w:lvl>
+    <w:lvl w:ilvl="8" w:tentative="1">
+      <w:start w:val="1"/>
+      <w:numFmt w:val="bullet"/>
+      <w:lvlText w:val=""/>
+      <w:lvlJc w:val="left"/>
+      <w:pPr>
+        <w:tabs>
+          <w:tab w:val="num" w:pos="6480"/>
+        </w:tabs>
+        <w:ind w:left="6480" w:hanging="360"/>
+      </w:pPr>
+      <w:rPr>
+        <w:rFonts w:ascii="Wingdings" w:hAnsi="Wingdings" w:hint="default"/>
+        <w:sz w:val="20"/>
+      </w:rPr>
+    </w:lvl>
+  </w:abstractNum>
+  <w:abstractNum w:abstractNumId="9" w15:restartNumberingAfterBreak="0">
     <w:nsid w:val="40E60990"/>
     <w:multiLevelType w:val="hybridMultilevel"/>
     <w:tmpl w:val="EFF41A04"/>
@@ -7338,7 +7767,7 @@
       </w:rPr>
     </w:lvl>
   </w:abstractNum>
-  <w:abstractNum w:abstractNumId="7" w15:restartNumberingAfterBreak="0">
+  <w:abstractNum w:abstractNumId="10" w15:restartNumberingAfterBreak="0">
     <w:nsid w:val="4A723AEF"/>
     <w:multiLevelType w:val="hybridMultilevel"/>
     <w:tmpl w:val="5B30B254"/>
@@ -7451,7 +7880,7 @@
       </w:rPr>
     </w:lvl>
   </w:abstractNum>
-  <w:abstractNum w:abstractNumId="8" w15:restartNumberingAfterBreak="0">
+  <w:abstractNum w:abstractNumId="11" w15:restartNumberingAfterBreak="0">
     <w:nsid w:val="4FE07844"/>
     <w:multiLevelType w:val="hybridMultilevel"/>
     <w:tmpl w:val="298893CA"/>
@@ -7537,7 +7966,301 @@
       </w:pPr>
     </w:lvl>
   </w:abstractNum>
-  <w:abstractNum w:abstractNumId="9" w15:restartNumberingAfterBreak="0">
+  <w:abstractNum w:abstractNumId="12" w15:restartNumberingAfterBreak="0">
+    <w:nsid w:val="522C2F96"/>
+    <w:multiLevelType w:val="multilevel"/>
+    <w:tmpl w:val="9C46CE14"/>
+    <w:lvl w:ilvl="0">
+      <w:start w:val="1"/>
+      <w:numFmt w:val="bullet"/>
+      <w:lvlText w:val=""/>
+      <w:lvlJc w:val="left"/>
+      <w:pPr>
+        <w:tabs>
+          <w:tab w:val="num" w:pos="720"/>
+        </w:tabs>
+        <w:ind w:left="720" w:hanging="360"/>
+      </w:pPr>
+      <w:rPr>
+        <w:rFonts w:ascii="Symbol" w:hAnsi="Symbol" w:hint="default"/>
+        <w:sz w:val="20"/>
+      </w:rPr>
+    </w:lvl>
+    <w:lvl w:ilvl="1">
+      <w:start w:val="1"/>
+      <w:numFmt w:val="decimal"/>
+      <w:lvlText w:val="%2."/>
+      <w:lvlJc w:val="left"/>
+      <w:pPr>
+        <w:tabs>
+          <w:tab w:val="num" w:pos="1440"/>
+        </w:tabs>
+        <w:ind w:left="1440" w:hanging="360"/>
+      </w:pPr>
+    </w:lvl>
+    <w:lvl w:ilvl="2" w:tentative="1">
+      <w:start w:val="1"/>
+      <w:numFmt w:val="bullet"/>
+      <w:lvlText w:val=""/>
+      <w:lvlJc w:val="left"/>
+      <w:pPr>
+        <w:tabs>
+          <w:tab w:val="num" w:pos="2160"/>
+        </w:tabs>
+        <w:ind w:left="2160" w:hanging="360"/>
+      </w:pPr>
+      <w:rPr>
+        <w:rFonts w:ascii="Wingdings" w:hAnsi="Wingdings" w:hint="default"/>
+        <w:sz w:val="20"/>
+      </w:rPr>
+    </w:lvl>
+    <w:lvl w:ilvl="3" w:tentative="1">
+      <w:start w:val="1"/>
+      <w:numFmt w:val="bullet"/>
+      <w:lvlText w:val=""/>
+      <w:lvlJc w:val="left"/>
+      <w:pPr>
+        <w:tabs>
+          <w:tab w:val="num" w:pos="2880"/>
+        </w:tabs>
+        <w:ind w:left="2880" w:hanging="360"/>
+      </w:pPr>
+      <w:rPr>
+        <w:rFonts w:ascii="Wingdings" w:hAnsi="Wingdings" w:hint="default"/>
+        <w:sz w:val="20"/>
+      </w:rPr>
+    </w:lvl>
+    <w:lvl w:ilvl="4" w:tentative="1">
+      <w:start w:val="1"/>
+      <w:numFmt w:val="bullet"/>
+      <w:lvlText w:val=""/>
+      <w:lvlJc w:val="left"/>
+      <w:pPr>
+        <w:tabs>
+          <w:tab w:val="num" w:pos="3600"/>
+        </w:tabs>
+        <w:ind w:left="3600" w:hanging="360"/>
+      </w:pPr>
+      <w:rPr>
+        <w:rFonts w:ascii="Wingdings" w:hAnsi="Wingdings" w:hint="default"/>
+        <w:sz w:val="20"/>
+      </w:rPr>
+    </w:lvl>
+    <w:lvl w:ilvl="5" w:tentative="1">
+      <w:start w:val="1"/>
+      <w:numFmt w:val="bullet"/>
+      <w:lvlText w:val=""/>
+      <w:lvlJc w:val="left"/>
+      <w:pPr>
+        <w:tabs>
+          <w:tab w:val="num" w:pos="4320"/>
+        </w:tabs>
+        <w:ind w:left="4320" w:hanging="360"/>
+      </w:pPr>
+      <w:rPr>
+        <w:rFonts w:ascii="Wingdings" w:hAnsi="Wingdings" w:hint="default"/>
+        <w:sz w:val="20"/>
+      </w:rPr>
+    </w:lvl>
+    <w:lvl w:ilvl="6" w:tentative="1">
+      <w:start w:val="1"/>
+      <w:numFmt w:val="bullet"/>
+      <w:lvlText w:val=""/>
+      <w:lvlJc w:val="left"/>
+      <w:pPr>
+        <w:tabs>
+          <w:tab w:val="num" w:pos="5040"/>
+        </w:tabs>
+        <w:ind w:left="5040" w:hanging="360"/>
+      </w:pPr>
+      <w:rPr>
+        <w:rFonts w:ascii="Wingdings" w:hAnsi="Wingdings" w:hint="default"/>
+        <w:sz w:val="20"/>
+      </w:rPr>
+    </w:lvl>
+    <w:lvl w:ilvl="7" w:tentative="1">
+      <w:start w:val="1"/>
+      <w:numFmt w:val="bullet"/>
+      <w:lvlText w:val=""/>
+      <w:lvlJc w:val="left"/>
+      <w:pPr>
+        <w:tabs>
+          <w:tab w:val="num" w:pos="5760"/>
+        </w:tabs>
+        <w:ind w:left="5760" w:hanging="360"/>
+      </w:pPr>
+      <w:rPr>
+        <w:rFonts w:ascii="Wingdings" w:hAnsi="Wingdings" w:hint="default"/>
+        <w:sz w:val="20"/>
+      </w:rPr>
+    </w:lvl>
+    <w:lvl w:ilvl="8" w:tentative="1">
+      <w:start w:val="1"/>
+      <w:numFmt w:val="bullet"/>
+      <w:lvlText w:val=""/>
+      <w:lvlJc w:val="left"/>
+      <w:pPr>
+        <w:tabs>
+          <w:tab w:val="num" w:pos="6480"/>
+        </w:tabs>
+        <w:ind w:left="6480" w:hanging="360"/>
+      </w:pPr>
+      <w:rPr>
+        <w:rFonts w:ascii="Wingdings" w:hAnsi="Wingdings" w:hint="default"/>
+        <w:sz w:val="20"/>
+      </w:rPr>
+    </w:lvl>
+  </w:abstractNum>
+  <w:abstractNum w:abstractNumId="13" w15:restartNumberingAfterBreak="0">
+    <w:nsid w:val="52D85F7E"/>
+    <w:multiLevelType w:val="multilevel"/>
+    <w:tmpl w:val="56CAED44"/>
+    <w:lvl w:ilvl="0">
+      <w:start w:val="1"/>
+      <w:numFmt w:val="bullet"/>
+      <w:lvlText w:val=""/>
+      <w:lvlJc w:val="left"/>
+      <w:pPr>
+        <w:tabs>
+          <w:tab w:val="num" w:pos="720"/>
+        </w:tabs>
+        <w:ind w:left="720" w:hanging="360"/>
+      </w:pPr>
+      <w:rPr>
+        <w:rFonts w:ascii="Symbol" w:hAnsi="Symbol" w:hint="default"/>
+        <w:sz w:val="20"/>
+      </w:rPr>
+    </w:lvl>
+    <w:lvl w:ilvl="1" w:tentative="1">
+      <w:start w:val="1"/>
+      <w:numFmt w:val="bullet"/>
+      <w:lvlText w:val="o"/>
+      <w:lvlJc w:val="left"/>
+      <w:pPr>
+        <w:tabs>
+          <w:tab w:val="num" w:pos="1440"/>
+        </w:tabs>
+        <w:ind w:left="1440" w:hanging="360"/>
+      </w:pPr>
+      <w:rPr>
+        <w:rFonts w:ascii="Courier New" w:hAnsi="Courier New" w:hint="default"/>
+        <w:sz w:val="20"/>
+      </w:rPr>
+    </w:lvl>
+    <w:lvl w:ilvl="2" w:tentative="1">
+      <w:start w:val="1"/>
+      <w:numFmt w:val="bullet"/>
+      <w:lvlText w:val=""/>
+      <w:lvlJc w:val="left"/>
+      <w:pPr>
+        <w:tabs>
+          <w:tab w:val="num" w:pos="2160"/>
+        </w:tabs>
+        <w:ind w:left="2160" w:hanging="360"/>
+      </w:pPr>
+      <w:rPr>
+        <w:rFonts w:ascii="Wingdings" w:hAnsi="Wingdings" w:hint="default"/>
+        <w:sz w:val="20"/>
+      </w:rPr>
+    </w:lvl>
+    <w:lvl w:ilvl="3" w:tentative="1">
+      <w:start w:val="1"/>
+      <w:numFmt w:val="bullet"/>
+      <w:lvlText w:val=""/>
+      <w:lvlJc w:val="left"/>
+      <w:pPr>
+        <w:tabs>
+          <w:tab w:val="num" w:pos="2880"/>
+        </w:tabs>
+        <w:ind w:left="2880" w:hanging="360"/>
+      </w:pPr>
+      <w:rPr>
+        <w:rFonts w:ascii="Wingdings" w:hAnsi="Wingdings" w:hint="default"/>
+        <w:sz w:val="20"/>
+      </w:rPr>
+    </w:lvl>
+    <w:lvl w:ilvl="4" w:tentative="1">
+      <w:start w:val="1"/>
+      <w:numFmt w:val="bullet"/>
+      <w:lvlText w:val=""/>
+      <w:lvlJc w:val="left"/>
+      <w:pPr>
+        <w:tabs>
+          <w:tab w:val="num" w:pos="3600"/>
+        </w:tabs>
+        <w:ind w:left="3600" w:hanging="360"/>
+      </w:pPr>
+      <w:rPr>
+        <w:rFonts w:ascii="Wingdings" w:hAnsi="Wingdings" w:hint="default"/>
+        <w:sz w:val="20"/>
+      </w:rPr>
+    </w:lvl>
+    <w:lvl w:ilvl="5" w:tentative="1">
+      <w:start w:val="1"/>
+      <w:numFmt w:val="bullet"/>
+      <w:lvlText w:val=""/>
+      <w:lvlJc w:val="left"/>
+      <w:pPr>
+        <w:tabs>
+          <w:tab w:val="num" w:pos="4320"/>
+        </w:tabs>
+        <w:ind w:left="4320" w:hanging="360"/>
+      </w:pPr>
+      <w:rPr>
+        <w:rFonts w:ascii="Wingdings" w:hAnsi="Wingdings" w:hint="default"/>
+        <w:sz w:val="20"/>
+      </w:rPr>
+    </w:lvl>
+    <w:lvl w:ilvl="6" w:tentative="1">
+      <w:start w:val="1"/>
+      <w:numFmt w:val="bullet"/>
+      <w:lvlText w:val=""/>
+      <w:lvlJc w:val="left"/>
+      <w:pPr>
+        <w:tabs>
+          <w:tab w:val="num" w:pos="5040"/>
+        </w:tabs>
+        <w:ind w:left="5040" w:hanging="360"/>
+      </w:pPr>
+      <w:rPr>
+        <w:rFonts w:ascii="Wingdings" w:hAnsi="Wingdings" w:hint="default"/>
+        <w:sz w:val="20"/>
+      </w:rPr>
+    </w:lvl>
+    <w:lvl w:ilvl="7" w:tentative="1">
+      <w:start w:val="1"/>
+      <w:numFmt w:val="bullet"/>
+      <w:lvlText w:val=""/>
+      <w:lvlJc w:val="left"/>
+      <w:pPr>
+        <w:tabs>
+          <w:tab w:val="num" w:pos="5760"/>
+        </w:tabs>
+        <w:ind w:left="5760" w:hanging="360"/>
+      </w:pPr>
+      <w:rPr>
+        <w:rFonts w:ascii="Wingdings" w:hAnsi="Wingdings" w:hint="default"/>
+        <w:sz w:val="20"/>
+      </w:rPr>
+    </w:lvl>
+    <w:lvl w:ilvl="8" w:tentative="1">
+      <w:start w:val="1"/>
+      <w:numFmt w:val="bullet"/>
+      <w:lvlText w:val=""/>
+      <w:lvlJc w:val="left"/>
+      <w:pPr>
+        <w:tabs>
+          <w:tab w:val="num" w:pos="6480"/>
+        </w:tabs>
+        <w:ind w:left="6480" w:hanging="360"/>
+      </w:pPr>
+      <w:rPr>
+        <w:rFonts w:ascii="Wingdings" w:hAnsi="Wingdings" w:hint="default"/>
+        <w:sz w:val="20"/>
+      </w:rPr>
+    </w:lvl>
+  </w:abstractNum>
+  <w:abstractNum w:abstractNumId="14" w15:restartNumberingAfterBreak="0">
     <w:nsid w:val="601011EB"/>
     <w:multiLevelType w:val="hybridMultilevel"/>
     <w:tmpl w:val="4814B6D4"/>
@@ -7650,7 +8373,7 @@
       </w:rPr>
     </w:lvl>
   </w:abstractNum>
-  <w:abstractNum w:abstractNumId="10" w15:restartNumberingAfterBreak="0">
+  <w:abstractNum w:abstractNumId="15" w15:restartNumberingAfterBreak="0">
     <w:nsid w:val="66EB0EB0"/>
     <w:multiLevelType w:val="hybridMultilevel"/>
     <w:tmpl w:val="33F6DF1A"/>
@@ -7763,7 +8486,156 @@
       </w:rPr>
     </w:lvl>
   </w:abstractNum>
-  <w:abstractNum w:abstractNumId="11" w15:restartNumberingAfterBreak="0">
+  <w:abstractNum w:abstractNumId="16" w15:restartNumberingAfterBreak="0">
+    <w:nsid w:val="6FFD1B75"/>
+    <w:multiLevelType w:val="multilevel"/>
+    <w:tmpl w:val="09C8B248"/>
+    <w:lvl w:ilvl="0">
+      <w:start w:val="1"/>
+      <w:numFmt w:val="bullet"/>
+      <w:lvlText w:val=""/>
+      <w:lvlJc w:val="left"/>
+      <w:pPr>
+        <w:tabs>
+          <w:tab w:val="num" w:pos="720"/>
+        </w:tabs>
+        <w:ind w:left="720" w:hanging="360"/>
+      </w:pPr>
+      <w:rPr>
+        <w:rFonts w:ascii="Symbol" w:hAnsi="Symbol" w:hint="default"/>
+        <w:sz w:val="20"/>
+      </w:rPr>
+    </w:lvl>
+    <w:lvl w:ilvl="1" w:tentative="1">
+      <w:start w:val="1"/>
+      <w:numFmt w:val="bullet"/>
+      <w:lvlText w:val="o"/>
+      <w:lvlJc w:val="left"/>
+      <w:pPr>
+        <w:tabs>
+          <w:tab w:val="num" w:pos="1440"/>
+        </w:tabs>
+        <w:ind w:left="1440" w:hanging="360"/>
+      </w:pPr>
+      <w:rPr>
+        <w:rFonts w:ascii="Courier New" w:hAnsi="Courier New" w:hint="default"/>
+        <w:sz w:val="20"/>
+      </w:rPr>
+    </w:lvl>
+    <w:lvl w:ilvl="2" w:tentative="1">
+      <w:start w:val="1"/>
+      <w:numFmt w:val="bullet"/>
+      <w:lvlText w:val=""/>
+      <w:lvlJc w:val="left"/>
+      <w:pPr>
+        <w:tabs>
+          <w:tab w:val="num" w:pos="2160"/>
+        </w:tabs>
+        <w:ind w:left="2160" w:hanging="360"/>
+      </w:pPr>
+      <w:rPr>
+        <w:rFonts w:ascii="Wingdings" w:hAnsi="Wingdings" w:hint="default"/>
+        <w:sz w:val="20"/>
+      </w:rPr>
+    </w:lvl>
+    <w:lvl w:ilvl="3" w:tentative="1">
+      <w:start w:val="1"/>
+      <w:numFmt w:val="bullet"/>
+      <w:lvlText w:val=""/>
+      <w:lvlJc w:val="left"/>
+      <w:pPr>
+        <w:tabs>
+          <w:tab w:val="num" w:pos="2880"/>
+        </w:tabs>
+        <w:ind w:left="2880" w:hanging="360"/>
+      </w:pPr>
+      <w:rPr>
+        <w:rFonts w:ascii="Wingdings" w:hAnsi="Wingdings" w:hint="default"/>
+        <w:sz w:val="20"/>
+      </w:rPr>
+    </w:lvl>
+    <w:lvl w:ilvl="4" w:tentative="1">
+      <w:start w:val="1"/>
+      <w:numFmt w:val="bullet"/>
+      <w:lvlText w:val=""/>
+      <w:lvlJc w:val="left"/>
+      <w:pPr>
+        <w:tabs>
+          <w:tab w:val="num" w:pos="3600"/>
+        </w:tabs>
+        <w:ind w:left="3600" w:hanging="360"/>
+      </w:pPr>
+      <w:rPr>
+        <w:rFonts w:ascii="Wingdings" w:hAnsi="Wingdings" w:hint="default"/>
+        <w:sz w:val="20"/>
+      </w:rPr>
+    </w:lvl>
+    <w:lvl w:ilvl="5" w:tentative="1">
+      <w:start w:val="1"/>
+      <w:numFmt w:val="bullet"/>
+      <w:lvlText w:val=""/>
+      <w:lvlJc w:val="left"/>
+      <w:pPr>
+        <w:tabs>
+          <w:tab w:val="num" w:pos="4320"/>
+        </w:tabs>
+        <w:ind w:left="4320" w:hanging="360"/>
+      </w:pPr>
+      <w:rPr>
+        <w:rFonts w:ascii="Wingdings" w:hAnsi="Wingdings" w:hint="default"/>
+        <w:sz w:val="20"/>
+      </w:rPr>
+    </w:lvl>
+    <w:lvl w:ilvl="6" w:tentative="1">
+      <w:start w:val="1"/>
+      <w:numFmt w:val="bullet"/>
+      <w:lvlText w:val=""/>
+      <w:lvlJc w:val="left"/>
+      <w:pPr>
+        <w:tabs>
+          <w:tab w:val="num" w:pos="5040"/>
+        </w:tabs>
+        <w:ind w:left="5040" w:hanging="360"/>
+      </w:pPr>
+      <w:rPr>
+        <w:rFonts w:ascii="Wingdings" w:hAnsi="Wingdings" w:hint="default"/>
+        <w:sz w:val="20"/>
+      </w:rPr>
+    </w:lvl>
+    <w:lvl w:ilvl="7" w:tentative="1">
+      <w:start w:val="1"/>
+      <w:numFmt w:val="bullet"/>
+      <w:lvlText w:val=""/>
+      <w:lvlJc w:val="left"/>
+      <w:pPr>
+        <w:tabs>
+          <w:tab w:val="num" w:pos="5760"/>
+        </w:tabs>
+        <w:ind w:left="5760" w:hanging="360"/>
+      </w:pPr>
+      <w:rPr>
+        <w:rFonts w:ascii="Wingdings" w:hAnsi="Wingdings" w:hint="default"/>
+        <w:sz w:val="20"/>
+      </w:rPr>
+    </w:lvl>
+    <w:lvl w:ilvl="8" w:tentative="1">
+      <w:start w:val="1"/>
+      <w:numFmt w:val="bullet"/>
+      <w:lvlText w:val=""/>
+      <w:lvlJc w:val="left"/>
+      <w:pPr>
+        <w:tabs>
+          <w:tab w:val="num" w:pos="6480"/>
+        </w:tabs>
+        <w:ind w:left="6480" w:hanging="360"/>
+      </w:pPr>
+      <w:rPr>
+        <w:rFonts w:ascii="Wingdings" w:hAnsi="Wingdings" w:hint="default"/>
+        <w:sz w:val="20"/>
+      </w:rPr>
+    </w:lvl>
+  </w:abstractNum>
+  <w:abstractNum w:abstractNumId="17" w15:restartNumberingAfterBreak="0">
     <w:nsid w:val="73C52850"/>
     <w:multiLevelType w:val="multilevel"/>
     <w:tmpl w:val="71AAFB7E"/>
@@ -7912,7 +8784,7 @@
       </w:rPr>
     </w:lvl>
   </w:abstractNum>
-  <w:abstractNum w:abstractNumId="12" w15:restartNumberingAfterBreak="0">
+  <w:abstractNum w:abstractNumId="18" w15:restartNumberingAfterBreak="0">
     <w:nsid w:val="79190623"/>
     <w:multiLevelType w:val="hybridMultilevel"/>
     <w:tmpl w:val="32624680"/>
@@ -8029,43 +8901,61 @@
     <w:abstractNumId w:val="0"/>
   </w:num>
   <w:num w:numId="2" w16cid:durableId="1788547119">
-    <w:abstractNumId w:val="11"/>
+    <w:abstractNumId w:val="17"/>
   </w:num>
   <w:num w:numId="3" w16cid:durableId="1955670391">
     <w:abstractNumId w:val="1"/>
   </w:num>
   <w:num w:numId="4" w16cid:durableId="1750344961">
-    <w:abstractNumId w:val="5"/>
+    <w:abstractNumId w:val="6"/>
     <w:lvlOverride w:ilvl="0">
       <w:startOverride w:val="1"/>
     </w:lvlOverride>
   </w:num>
   <w:num w:numId="5" w16cid:durableId="1580359968">
-    <w:abstractNumId w:val="6"/>
+    <w:abstractNumId w:val="9"/>
   </w:num>
   <w:num w:numId="6" w16cid:durableId="271791724">
-    <w:abstractNumId w:val="12"/>
+    <w:abstractNumId w:val="18"/>
   </w:num>
   <w:num w:numId="7" w16cid:durableId="436946062">
-    <w:abstractNumId w:val="4"/>
+    <w:abstractNumId w:val="5"/>
   </w:num>
   <w:num w:numId="8" w16cid:durableId="1164080157">
-    <w:abstractNumId w:val="8"/>
+    <w:abstractNumId w:val="11"/>
   </w:num>
   <w:num w:numId="9" w16cid:durableId="777799975">
     <w:abstractNumId w:val="2"/>
   </w:num>
   <w:num w:numId="10" w16cid:durableId="1902524384">
-    <w:abstractNumId w:val="7"/>
+    <w:abstractNumId w:val="10"/>
   </w:num>
   <w:num w:numId="11" w16cid:durableId="214893538">
     <w:abstractNumId w:val="3"/>
   </w:num>
   <w:num w:numId="12" w16cid:durableId="1486236523">
-    <w:abstractNumId w:val="10"/>
+    <w:abstractNumId w:val="15"/>
   </w:num>
   <w:num w:numId="13" w16cid:durableId="1529836961">
-    <w:abstractNumId w:val="9"/>
+    <w:abstractNumId w:val="14"/>
+  </w:num>
+  <w:num w:numId="14" w16cid:durableId="171575627">
+    <w:abstractNumId w:val="16"/>
+  </w:num>
+  <w:num w:numId="15" w16cid:durableId="1613198367">
+    <w:abstractNumId w:val="7"/>
+  </w:num>
+  <w:num w:numId="16" w16cid:durableId="1502506289">
+    <w:abstractNumId w:val="4"/>
+  </w:num>
+  <w:num w:numId="17" w16cid:durableId="1844856655">
+    <w:abstractNumId w:val="8"/>
+  </w:num>
+  <w:num w:numId="18" w16cid:durableId="672682755">
+    <w:abstractNumId w:val="12"/>
+  </w:num>
+  <w:num w:numId="19" w16cid:durableId="16199334">
+    <w:abstractNumId w:val="13"/>
   </w:num>
 </w:numbering>
 </file>

</xml_diff>

<commit_message>
add code llm extraction
</commit_message>
<xml_diff>
--- a/Tài liệu nghiên cứu,đề xuât mô hình và thuật toán cho các module.docx
+++ b/Tài liệu nghiên cứu,đề xuât mô hình và thuật toán cho các module.docx
@@ -8979,7 +8979,7 @@
           <w:sz w:val="26"/>
           <w:szCs w:val="26"/>
         </w:rPr>
-        <w:t xml:space="preserve"> Hoàn toàn "mù" về không gian tọa độ (không có Bounding Box). Sẽ thất bại nếu đối mặt với biểu mẫu (form) hoặc bảng biểu phức tạp nơi ngữ nghĩa phụ thuộc vào vị trí hàng/cột chứ không phải ngữ pháp câu.</w:t>
+        <w:t xml:space="preserve"> Hoàn toàn mù về không gian tọa độ (không có Bounding Box). Sẽ thất bại nếu đối mặt với biểu mẫu (form) hoặc bảng biểu phức tạp nơi ngữ nghĩa phụ thuộc vào vị trí hàng/cột chứ không phải ngữ pháp câu.</w:t>
       </w:r>
     </w:p>
     <w:p>
@@ -10944,7 +10944,6 @@
           <w:color w:val="000000" w:themeColor="text1"/>
           <w:sz w:val="26"/>
           <w:szCs w:val="26"/>
-          <w:lang w:val="en-US"/>
         </w:rPr>
       </w:pPr>
     </w:p>
@@ -11384,7 +11383,6 @@
           <w:color w:val="000000" w:themeColor="text1"/>
           <w:sz w:val="26"/>
           <w:szCs w:val="26"/>
-          <w:lang w:val="en-US"/>
         </w:rPr>
       </w:pPr>
       <w:r>
@@ -11407,7 +11405,6 @@
           <w:color w:val="000000" w:themeColor="text1"/>
           <w:sz w:val="26"/>
           <w:szCs w:val="26"/>
-          <w:lang w:val="en-US"/>
         </w:rPr>
       </w:pPr>
       <w:r>
@@ -11428,7 +11425,6 @@
           <w:color w:val="000000" w:themeColor="text1"/>
           <w:sz w:val="26"/>
           <w:szCs w:val="26"/>
-          <w:lang w:val="en-US"/>
         </w:rPr>
       </w:pPr>
       <w:r>
@@ -11449,16 +11445,14 @@
           <w:color w:val="000000" w:themeColor="text1"/>
           <w:sz w:val="26"/>
           <w:szCs w:val="26"/>
-          <w:lang w:val="en-US"/>
-        </w:rPr>
-      </w:pPr>
-      <w:r>
-        <w:rPr>
-          <w:rFonts w:asciiTheme="majorHAnsi" w:hAnsiTheme="majorHAnsi" w:cstheme="majorHAnsi"/>
-          <w:color w:val="000000" w:themeColor="text1"/>
-          <w:sz w:val="26"/>
-          <w:szCs w:val="26"/>
-          <w:lang w:val="en-US"/>
+        </w:rPr>
+      </w:pPr>
+      <w:r>
+        <w:rPr>
+          <w:rFonts w:asciiTheme="majorHAnsi" w:hAnsiTheme="majorHAnsi" w:cstheme="majorHAnsi"/>
+          <w:color w:val="000000" w:themeColor="text1"/>
+          <w:sz w:val="26"/>
+          <w:szCs w:val="26"/>
         </w:rPr>
         <w:t>Khả năng Zero-shot / Heuristic: Có thể không cần huấn luyện GCN mà chỉ dùng các luật (Rule-based) trên tọa độ đồ thị (ví dụ: "Tìm Anchor A, quét text nằm trong bán kính r về bên phải").</w:t>
       </w:r>
@@ -11471,7 +11465,6 @@
           <w:color w:val="000000" w:themeColor="text1"/>
           <w:sz w:val="26"/>
           <w:szCs w:val="26"/>
-          <w:lang w:val="en-US"/>
         </w:rPr>
       </w:pPr>
       <w:r>
@@ -11492,7 +11485,6 @@
           <w:color w:val="000000" w:themeColor="text1"/>
           <w:sz w:val="26"/>
           <w:szCs w:val="26"/>
-          <w:lang w:val="en-US"/>
         </w:rPr>
       </w:pPr>
       <w:r>
@@ -11524,7 +11516,6 @@
           <w:color w:val="000000" w:themeColor="text1"/>
           <w:sz w:val="26"/>
           <w:szCs w:val="26"/>
-          <w:lang w:val="en-US"/>
         </w:rPr>
       </w:pPr>
       <w:r>
@@ -16925,6 +16916,7 @@
   <w:style w:type="character" w:default="1" w:styleId="DefaultParagraphFont">
     <w:name w:val="Default Paragraph Font"/>
     <w:uiPriority w:val="1"/>
+    <w:semiHidden/>
     <w:unhideWhenUsed/>
   </w:style>
   <w:style w:type="table" w:default="1" w:styleId="TableNormal">

</xml_diff>